<commit_message>
feat: add JSON schema template for AppSheet data integration and update estimate generator service
</commit_message>
<xml_diff>
--- a/REFACTOR_TEST_RESULT.docx
+++ b/REFACTOR_TEST_RESULT.docx
@@ -1746,7 +1746,6 @@
         <w:rPr>
           <w:b/>
         </w:rPr>
-        <w:t>Tableware &amp; Linens</w:t>
         <w:tab/>
         <w:t>$350.00</w:t>
       </w:r>
@@ -1768,6 +1767,9 @@
     </w:p>
     <w:p>
       <w:pPr>
+        <w:tabs>
+          <w:tab w:pos="9354" w:val="right"/>
+        </w:tabs>
         <w:spacing w:after="40" w:before="0"/>
       </w:pPr>
       <w:r>
@@ -1782,12 +1784,19 @@
       </w:r>
       <w:r>
         <w:t>Food</w:t>
+      </w:r>
+      <w:r>
         <w:tab/>
+      </w:r>
+      <w:r>
         <w:t>$2,500.00</w:t>
       </w:r>
     </w:p>
     <w:p>
       <w:pPr>
+        <w:tabs>
+          <w:tab w:pos="9354" w:val="right"/>
+        </w:tabs>
         <w:spacing w:after="40" w:before="0"/>
       </w:pPr>
       <w:r>
@@ -1802,12 +1811,19 @@
       </w:r>
       <w:r>
         <w:t>Labor Cost</w:t>
+      </w:r>
+      <w:r>
         <w:tab/>
+      </w:r>
+      <w:r>
         <w:t>$800.00</w:t>
       </w:r>
     </w:p>
     <w:p>
       <w:pPr>
+        <w:tabs>
+          <w:tab w:pos="9354" w:val="right"/>
+        </w:tabs>
         <w:spacing w:after="40" w:before="0"/>
       </w:pPr>
       <w:r>
@@ -1822,12 +1838,19 @@
       </w:r>
       <w:r>
         <w:t>Extras Services</w:t>
+      </w:r>
+      <w:r>
         <w:tab/>
+      </w:r>
+      <w:r>
         <w:t>$350.00</w:t>
       </w:r>
     </w:p>
     <w:p>
       <w:pPr>
+        <w:tabs>
+          <w:tab w:pos="9354" w:val="right"/>
+        </w:tabs>
         <w:spacing w:after="40" w:before="0"/>
       </w:pPr>
       <w:r>
@@ -1842,12 +1865,19 @@
       </w:r>
       <w:r>
         <w:t>6.625% NJ Sales Tax</w:t>
+      </w:r>
+      <w:r>
         <w:tab/>
+      </w:r>
+      <w:r>
         <w:t>$12.00</w:t>
       </w:r>
     </w:p>
     <w:p>
       <w:pPr>
+        <w:tabs>
+          <w:tab w:pos="9354" w:val="right"/>
+        </w:tabs>
         <w:spacing w:after="40" w:before="0"/>
       </w:pPr>
       <w:r>
@@ -1862,7 +1892,11 @@
       </w:r>
       <w:r>
         <w:t>22% Service Charge</w:t>
+      </w:r>
+      <w:r>
         <w:tab/>
+      </w:r>
+      <w:r>
         <w:t>$550.00</w:t>
       </w:r>
     </w:p>
@@ -1871,16 +1905,27 @@
         <w:pBdr>
           <w:top w:val="single" w:sz="12" w:color="612D4B"/>
         </w:pBdr>
-        <w:spacing w:after="120" w:before="160"/>
-      </w:pPr>
+        <w:tabs>
+          <w:tab w:pos="9354" w:val="right"/>
+        </w:tabs>
+        <w:spacing w:after="40" w:before="160"/>
+      </w:pPr>
+      <w:r>
+        <w:rPr>
+          <w:rFonts w:ascii="Open Sans" w:hAnsi="Open Sans" w:cs="Open Sans"/>
+          <w:b w:val="0"/>
+          <w:i w:val="0"/>
+          <w:color w:val="333333"/>
+          <w:sz w:val="22"/>
+          <w:u w:val="none"/>
+        </w:rPr>
+      </w:r>
       <w:r>
         <w:rPr>
           <w:rFonts w:ascii="Open Sans" w:hAnsi="Open Sans" w:cs="Open Sans"/>
           <w:b/>
-          <w:i w:val="0"/>
           <w:color w:val="612D4B"/>
           <w:sz w:val="26"/>
-          <w:u w:val="none"/>
         </w:rPr>
         <w:t>Total Estimate</w:t>
         <w:tab/>

</xml_diff>